<commit_message>
arreglos de errores de inventario, optimizar codigo
</commit_message>
<xml_diff>
--- a/plantillas/bajas.docx
+++ b/plantillas/bajas.docx
@@ -1591,9 +1591,8 @@
     <w:p>
       <w:pPr>
         <w:pStyle w:val="NormalWeb"/>
-        <w:jc w:val="both"/>
-        <w:rPr>
-          <w:rFonts w:ascii="Microsoft Sans Serif" w:hAnsi="Microsoft Sans Serif" w:cs="Microsoft Sans Serif"/>
+        <w:rPr>
+          <w:rFonts w:ascii="Arial" w:hAnsi="Arial" w:cs="Arial"/>
           <w:sz w:val="20"/>
           <w:lang w:val="es-MX"/>
         </w:rPr>
@@ -1602,10 +1601,9 @@
     <w:p>
       <w:pPr>
         <w:pStyle w:val="NormalWeb"/>
-        <w:jc w:val="both"/>
-        <w:rPr>
-          <w:rFonts w:asciiTheme="minorHAnsi" w:hAnsiTheme="minorHAnsi" w:cstheme="minorHAnsi"/>
-          <w:sz w:val="18"/>
+        <w:rPr>
+          <w:rFonts w:ascii="Arial" w:hAnsi="Arial" w:cs="Arial"/>
+          <w:sz w:val="20"/>
           <w:lang w:val="es-MX"/>
         </w:rPr>
       </w:pPr>
@@ -1613,410 +1611,383 @@
     <w:p>
       <w:pPr>
         <w:pStyle w:val="NormalWeb"/>
+        <w:rPr>
+          <w:rFonts w:ascii="Arial" w:hAnsi="Arial" w:cs="Arial"/>
+          <w:sz w:val="20"/>
+          <w:lang w:val="es-MX"/>
+        </w:rPr>
+      </w:pPr>
+    </w:p>
+    <w:tbl>
+      <w:tblPr>
+        <w:tblStyle w:val="Tablanormal2"/>
+        <w:tblW w:w="0" w:type="auto"/>
+        <w:tblLook w:val="0600" w:firstRow="0" w:lastRow="0" w:firstColumn="0" w:lastColumn="0" w:noHBand="1" w:noVBand="1"/>
+      </w:tblPr>
+      <w:tblGrid>
+        <w:gridCol w:w="4414"/>
+        <w:gridCol w:w="4414"/>
+      </w:tblGrid>
+      <w:tr>
+        <w:tc>
+          <w:tcPr>
+            <w:tcW w:w="4414" w:type="dxa"/>
+            <w:tcBorders>
+              <w:top w:val="single" w:sz="4" w:space="0" w:color="FFFFFF"/>
+            </w:tcBorders>
+          </w:tcPr>
+          <w:p>
+            <w:pPr>
+              <w:pStyle w:val="NormalWeb"/>
+              <w:jc w:val="center"/>
+              <w:rPr>
+                <w:rFonts w:ascii="Microsoft Sans Serif" w:hAnsi="Microsoft Sans Serif" w:cs="Microsoft Sans Serif"/>
+                <w:sz w:val="20"/>
+                <w:lang w:val="es-MX"/>
+              </w:rPr>
+            </w:pPr>
+            <w:r>
+              <w:rPr>
+                <w:rFonts w:ascii="Arial MT" w:hAnsi="Arial MT" w:cs="Microsoft Sans Serif"/>
+                <w:b/>
+                <w:sz w:val="18"/>
+                <w:lang w:val="es-MX"/>
+              </w:rPr>
+              <w:t>{{</w:t>
+            </w:r>
+            <w:proofErr w:type="spellStart"/>
+            <w:r>
+              <w:rPr>
+                <w:rFonts w:ascii="Arial MT" w:hAnsi="Arial MT" w:cs="Microsoft Sans Serif"/>
+                <w:b/>
+                <w:sz w:val="18"/>
+                <w:lang w:val="es-MX"/>
+              </w:rPr>
+              <w:t>entregado_por</w:t>
+            </w:r>
+            <w:proofErr w:type="spellEnd"/>
+            <w:r>
+              <w:rPr>
+                <w:rFonts w:ascii="Arial MT" w:hAnsi="Arial MT" w:cs="Microsoft Sans Serif"/>
+                <w:b/>
+                <w:sz w:val="18"/>
+                <w:lang w:val="es-MX"/>
+              </w:rPr>
+              <w:t>}}</w:t>
+            </w:r>
+          </w:p>
+        </w:tc>
+        <w:tc>
+          <w:tcPr>
+            <w:tcW w:w="4414" w:type="dxa"/>
+            <w:tcBorders>
+              <w:top w:val="single" w:sz="4" w:space="0" w:color="FFFFFF" w:themeColor="background1"/>
+            </w:tcBorders>
+          </w:tcPr>
+          <w:p>
+            <w:pPr>
+              <w:pStyle w:val="NormalWeb"/>
+              <w:jc w:val="center"/>
+              <w:rPr>
+                <w:rFonts w:ascii="Microsoft Sans Serif" w:hAnsi="Microsoft Sans Serif" w:cs="Microsoft Sans Serif"/>
+                <w:sz w:val="20"/>
+                <w:lang w:val="es-MX"/>
+              </w:rPr>
+            </w:pPr>
+            <w:r>
+              <w:rPr>
+                <w:rFonts w:ascii="Arial MT" w:hAnsi="Arial MT" w:cs="Microsoft Sans Serif"/>
+                <w:b/>
+                <w:sz w:val="18"/>
+                <w:lang w:val="es-MX"/>
+              </w:rPr>
+              <w:t>{{</w:t>
+            </w:r>
+            <w:proofErr w:type="spellStart"/>
+            <w:r>
+              <w:rPr>
+                <w:rFonts w:ascii="Arial MT" w:hAnsi="Arial MT" w:cs="Microsoft Sans Serif"/>
+                <w:b/>
+                <w:sz w:val="18"/>
+                <w:lang w:val="es-MX"/>
+              </w:rPr>
+              <w:t>recibido_por</w:t>
+            </w:r>
+            <w:proofErr w:type="spellEnd"/>
+            <w:r>
+              <w:rPr>
+                <w:rFonts w:ascii="Arial MT" w:hAnsi="Arial MT" w:cs="Microsoft Sans Serif"/>
+                <w:b/>
+                <w:sz w:val="18"/>
+                <w:lang w:val="es-MX"/>
+              </w:rPr>
+              <w:t>}}</w:t>
+            </w:r>
+          </w:p>
+        </w:tc>
+      </w:tr>
+      <w:tr>
+        <w:tc>
+          <w:tcPr>
+            <w:tcW w:w="4414" w:type="dxa"/>
+          </w:tcPr>
+          <w:p>
+            <w:pPr>
+              <w:pStyle w:val="NormalWeb"/>
+              <w:jc w:val="center"/>
+              <w:rPr>
+                <w:rFonts w:ascii="Microsoft Sans Serif" w:hAnsi="Microsoft Sans Serif" w:cs="Microsoft Sans Serif"/>
+                <w:sz w:val="20"/>
+                <w:lang w:val="es-MX"/>
+              </w:rPr>
+            </w:pPr>
+            <w:r>
+              <w:rPr>
+                <w:rFonts w:ascii="Arial MT" w:hAnsi="Arial MT"/>
+                <w:b/>
+                <w:sz w:val="18"/>
+                <w:lang w:val="es-MX"/>
+              </w:rPr>
+              <w:t>{{</w:t>
+            </w:r>
+            <w:proofErr w:type="spellStart"/>
+            <w:r>
+              <w:rPr>
+                <w:rFonts w:ascii="Arial MT" w:hAnsi="Arial MT"/>
+                <w:b/>
+                <w:sz w:val="18"/>
+                <w:lang w:val="es-MX"/>
+              </w:rPr>
+              <w:t>rol_entrega</w:t>
+            </w:r>
+            <w:proofErr w:type="spellEnd"/>
+            <w:r>
+              <w:rPr>
+                <w:rFonts w:ascii="Arial MT" w:hAnsi="Arial MT"/>
+                <w:b/>
+                <w:sz w:val="18"/>
+                <w:lang w:val="es-MX"/>
+              </w:rPr>
+              <w:t>}}</w:t>
+            </w:r>
+          </w:p>
+        </w:tc>
+        <w:tc>
+          <w:tcPr>
+            <w:tcW w:w="4414" w:type="dxa"/>
+          </w:tcPr>
+          <w:p>
+            <w:pPr>
+              <w:pStyle w:val="NormalWeb"/>
+              <w:jc w:val="center"/>
+              <w:rPr>
+                <w:rFonts w:ascii="Microsoft Sans Serif" w:hAnsi="Microsoft Sans Serif" w:cs="Microsoft Sans Serif"/>
+                <w:sz w:val="20"/>
+                <w:lang w:val="es-MX"/>
+              </w:rPr>
+            </w:pPr>
+            <w:r>
+              <w:rPr>
+                <w:rFonts w:ascii="Arial MT" w:hAnsi="Arial MT"/>
+                <w:b/>
+                <w:sz w:val="18"/>
+                <w:lang w:val="es-MX"/>
+              </w:rPr>
+              <w:t>USUARIO FINAL</w:t>
+            </w:r>
+          </w:p>
+        </w:tc>
+      </w:tr>
+      <w:tr>
+        <w:tc>
+          <w:tcPr>
+            <w:tcW w:w="4414" w:type="dxa"/>
+          </w:tcPr>
+          <w:p>
+            <w:pPr>
+              <w:pStyle w:val="NormalWeb"/>
+              <w:jc w:val="center"/>
+              <w:rPr>
+                <w:rFonts w:ascii="Microsoft Sans Serif" w:hAnsi="Microsoft Sans Serif" w:cs="Microsoft Sans Serif"/>
+                <w:sz w:val="20"/>
+                <w:lang w:val="es-MX"/>
+              </w:rPr>
+            </w:pPr>
+            <w:r>
+              <w:rPr>
+                <w:rFonts w:ascii="Arial MT" w:hAnsi="Arial MT"/>
+                <w:b/>
+                <w:sz w:val="18"/>
+                <w:lang w:val="es-MX"/>
+              </w:rPr>
+              <w:t>FACULTAD DE JURISPRUCENDIA</w:t>
+            </w:r>
+            <w:r>
+              <w:rPr>
+                <w:rFonts w:ascii="Arial MT" w:hAnsi="Arial MT"/>
+                <w:b/>
+                <w:sz w:val="18"/>
+                <w:lang w:val="es-MX"/>
+              </w:rPr>
+              <w:t>, CIENCIAS SOCIALES Y POLÌTICAS</w:t>
+            </w:r>
+          </w:p>
+        </w:tc>
+        <w:tc>
+          <w:tcPr>
+            <w:tcW w:w="4414" w:type="dxa"/>
+          </w:tcPr>
+          <w:p>
+            <w:pPr>
+              <w:pStyle w:val="NormalWeb"/>
+              <w:jc w:val="center"/>
+              <w:rPr>
+                <w:rFonts w:ascii="Microsoft Sans Serif" w:hAnsi="Microsoft Sans Serif" w:cs="Microsoft Sans Serif"/>
+                <w:sz w:val="20"/>
+                <w:lang w:val="es-MX"/>
+              </w:rPr>
+            </w:pPr>
+            <w:r>
+              <w:rPr>
+                <w:rFonts w:ascii="Arial MT" w:hAnsi="Arial MT"/>
+                <w:b/>
+                <w:sz w:val="18"/>
+                <w:lang w:val="es-MX"/>
+              </w:rPr>
+              <w:t>FACULTAD DE JURISPRUCENDIA</w:t>
+            </w:r>
+            <w:r>
+              <w:rPr>
+                <w:rFonts w:ascii="Arial MT" w:hAnsi="Arial MT"/>
+                <w:b/>
+                <w:sz w:val="18"/>
+                <w:lang w:val="es-MX"/>
+              </w:rPr>
+              <w:t>, CIENCIAS SOCIALES Y POLÌTICAS</w:t>
+            </w:r>
+          </w:p>
+        </w:tc>
+      </w:tr>
+      <w:tr>
+        <w:tc>
+          <w:tcPr>
+            <w:tcW w:w="4414" w:type="dxa"/>
+            <w:tcBorders>
+              <w:bottom w:val="single" w:sz="4" w:space="0" w:color="FFFFFF"/>
+            </w:tcBorders>
+          </w:tcPr>
+          <w:p>
+            <w:pPr>
+              <w:pStyle w:val="NormalWeb"/>
+              <w:jc w:val="center"/>
+              <w:rPr>
+                <w:rFonts w:ascii="Arial MT" w:hAnsi="Arial MT" w:cs="Arial"/>
+                <w:sz w:val="20"/>
+                <w:lang w:val="es-MX"/>
+              </w:rPr>
+            </w:pPr>
+          </w:p>
+          <w:p>
+            <w:pPr>
+              <w:pStyle w:val="NormalWeb"/>
+              <w:jc w:val="center"/>
+              <w:rPr>
+                <w:rFonts w:ascii="Microsoft Sans Serif" w:hAnsi="Microsoft Sans Serif" w:cs="Microsoft Sans Serif"/>
+                <w:sz w:val="20"/>
+                <w:lang w:val="es-MX"/>
+              </w:rPr>
+            </w:pPr>
+            <w:r>
+              <w:rPr>
+                <w:rFonts w:ascii="Arial MT" w:hAnsi="Arial MT" w:cs="Arial"/>
+                <w:b/>
+                <w:sz w:val="20"/>
+                <w:lang w:val="es-MX"/>
+              </w:rPr>
+              <w:t>Entrega</w:t>
+            </w:r>
+            <w:r>
+              <w:rPr>
+                <w:rFonts w:ascii="Arial MT" w:hAnsi="Arial MT" w:cs="Arial"/>
+                <w:sz w:val="20"/>
+                <w:lang w:val="es-MX"/>
+              </w:rPr>
+              <w:t xml:space="preserve"> </w:t>
+            </w:r>
+            <w:r>
+              <w:rPr>
+                <w:rFonts w:ascii="Arial MT" w:hAnsi="Arial MT" w:cs="Arial"/>
+                <w:b/>
+                <w:sz w:val="20"/>
+                <w:lang w:val="es-MX"/>
+              </w:rPr>
+              <w:t>Conforme</w:t>
+            </w:r>
+          </w:p>
+        </w:tc>
+        <w:tc>
+          <w:tcPr>
+            <w:tcW w:w="4414" w:type="dxa"/>
+            <w:tcBorders>
+              <w:bottom w:val="single" w:sz="4" w:space="0" w:color="FFFFFF"/>
+            </w:tcBorders>
+          </w:tcPr>
+          <w:p>
+            <w:pPr>
+              <w:pStyle w:val="NormalWeb"/>
+              <w:jc w:val="center"/>
+              <w:rPr>
+                <w:rFonts w:ascii="Arial MT" w:hAnsi="Arial MT" w:cs="Microsoft Sans Serif"/>
+                <w:sz w:val="20"/>
+                <w:lang w:val="es-MX"/>
+              </w:rPr>
+            </w:pPr>
+          </w:p>
+          <w:p>
+            <w:pPr>
+              <w:pStyle w:val="NormalWeb"/>
+              <w:jc w:val="center"/>
+              <w:rPr>
+                <w:rFonts w:ascii="Arial" w:hAnsi="Arial" w:cs="Arial"/>
+                <w:b/>
+                <w:sz w:val="20"/>
+                <w:lang w:val="es-MX"/>
+              </w:rPr>
+            </w:pPr>
+            <w:r>
+              <w:rPr>
+                <w:rFonts w:ascii="Arial MT" w:hAnsi="Arial MT" w:cs="Arial"/>
+                <w:b/>
+                <w:sz w:val="20"/>
+                <w:lang w:val="es-MX"/>
+              </w:rPr>
+              <w:t>Recibe Conforme</w:t>
+            </w:r>
+          </w:p>
+        </w:tc>
+      </w:tr>
+    </w:tbl>
+    <w:p>
+      <w:pPr>
+        <w:pStyle w:val="NormalWeb"/>
         <w:jc w:val="both"/>
         <w:rPr>
-          <w:rFonts w:asciiTheme="minorHAnsi" w:hAnsiTheme="minorHAnsi" w:cstheme="minorHAnsi"/>
-          <w:sz w:val="18"/>
+          <w:rFonts w:ascii="Microsoft Sans Serif" w:hAnsi="Microsoft Sans Serif" w:cs="Microsoft Sans Serif"/>
+          <w:sz w:val="20"/>
           <w:lang w:val="es-MX"/>
         </w:rPr>
       </w:pPr>
     </w:p>
     <w:p>
       <w:pPr>
-        <w:pStyle w:val="NormalWeb"/>
-        <w:spacing w:before="0" w:beforeAutospacing="0"/>
-        <w:jc w:val="center"/>
-        <w:rPr>
-          <w:rFonts w:ascii="Arial MT" w:hAnsi="Arial MT" w:cs="Microsoft Sans Serif"/>
-          <w:b/>
-          <w:sz w:val="18"/>
-          <w:lang w:val="es-MX"/>
-        </w:rPr>
-      </w:pPr>
-      <w:r>
-        <w:rPr>
-          <w:rFonts w:ascii="Arial MT" w:hAnsi="Arial MT" w:cs="Microsoft Sans Serif"/>
-          <w:b/>
-          <w:sz w:val="18"/>
-          <w:lang w:val="es-MX"/>
-        </w:rPr>
-        <w:t xml:space="preserve">       </w:t>
-      </w:r>
-      <w:r>
-        <w:rPr>
-          <w:rFonts w:ascii="Arial MT" w:hAnsi="Arial MT" w:cs="Microsoft Sans Serif"/>
-          <w:b/>
-          <w:sz w:val="18"/>
-          <w:lang w:val="es-MX"/>
-        </w:rPr>
-        <w:t>{{</w:t>
-      </w:r>
-      <w:proofErr w:type="spellStart"/>
-      <w:r>
-        <w:rPr>
-          <w:rFonts w:ascii="Arial MT" w:hAnsi="Arial MT" w:cs="Microsoft Sans Serif"/>
-          <w:b/>
-          <w:sz w:val="18"/>
-          <w:lang w:val="es-MX"/>
-        </w:rPr>
-        <w:t>entregado_por</w:t>
-      </w:r>
-      <w:proofErr w:type="spellEnd"/>
-      <w:r>
-        <w:rPr>
-          <w:rFonts w:ascii="Arial MT" w:hAnsi="Arial MT" w:cs="Microsoft Sans Serif"/>
-          <w:b/>
-          <w:sz w:val="18"/>
-          <w:lang w:val="es-MX"/>
-        </w:rPr>
-        <w:t>}}</w:t>
-      </w:r>
-      <w:r>
-        <w:rPr>
-          <w:rFonts w:ascii="Arial MT" w:hAnsi="Arial MT" w:cs="Microsoft Sans Serif"/>
-          <w:b/>
-          <w:sz w:val="18"/>
-          <w:lang w:val="es-MX"/>
-        </w:rPr>
-        <w:t xml:space="preserve">                             </w:t>
-      </w:r>
-      <w:r>
-        <w:rPr>
-          <w:rFonts w:ascii="Arial MT" w:hAnsi="Arial MT" w:cs="Microsoft Sans Serif"/>
-          <w:b/>
-          <w:sz w:val="18"/>
-          <w:lang w:val="es-MX"/>
-        </w:rPr>
-        <w:t xml:space="preserve">                   </w:t>
-      </w:r>
-      <w:r>
-        <w:rPr>
-          <w:rFonts w:ascii="Arial MT" w:hAnsi="Arial MT" w:cs="Microsoft Sans Serif"/>
-          <w:b/>
-          <w:sz w:val="18"/>
-          <w:lang w:val="es-MX"/>
-        </w:rPr>
-        <w:t xml:space="preserve"> </w:t>
-      </w:r>
-      <w:r>
-        <w:rPr>
-          <w:rFonts w:ascii="Arial MT" w:hAnsi="Arial MT" w:cs="Microsoft Sans Serif"/>
-          <w:b/>
-          <w:sz w:val="18"/>
-          <w:lang w:val="es-MX"/>
-        </w:rPr>
-        <w:t xml:space="preserve">          </w:t>
-      </w:r>
+        <w:jc w:val="both"/>
+        <w:rPr>
+          <w:sz w:val="16"/>
+          <w:lang w:val="es-MX"/>
+        </w:rPr>
+      </w:pPr>
       <w:bookmarkStart w:id="0" w:name="_GoBack"/>
       <w:bookmarkEnd w:id="0"/>
-      <w:r>
-        <w:rPr>
-          <w:rFonts w:ascii="Arial MT" w:hAnsi="Arial MT" w:cs="Microsoft Sans Serif"/>
-          <w:b/>
-          <w:sz w:val="18"/>
-          <w:lang w:val="es-MX"/>
-        </w:rPr>
-        <w:t>{{</w:t>
-      </w:r>
-      <w:proofErr w:type="spellStart"/>
-      <w:r>
-        <w:rPr>
-          <w:rFonts w:ascii="Arial MT" w:hAnsi="Arial MT" w:cs="Microsoft Sans Serif"/>
-          <w:b/>
-          <w:sz w:val="18"/>
-          <w:lang w:val="es-MX"/>
-        </w:rPr>
-        <w:t>recibido_por</w:t>
-      </w:r>
-      <w:proofErr w:type="spellEnd"/>
-      <w:r>
-        <w:rPr>
-          <w:rFonts w:ascii="Arial MT" w:hAnsi="Arial MT" w:cs="Microsoft Sans Serif"/>
-          <w:b/>
-          <w:sz w:val="18"/>
-          <w:lang w:val="es-MX"/>
-        </w:rPr>
-        <w:t>}}</w:t>
-      </w:r>
-      <w:r>
-        <w:rPr>
-          <w:rFonts w:ascii="Arial MT" w:hAnsi="Arial MT" w:cs="Microsoft Sans Serif"/>
-          <w:b/>
-          <w:sz w:val="18"/>
-          <w:lang w:val="es-MX"/>
-        </w:rPr>
-        <w:t xml:space="preserve">                           </w:t>
-      </w:r>
-      <w:r>
-        <w:rPr>
-          <w:rFonts w:ascii="Arial MT" w:hAnsi="Arial MT" w:cs="Microsoft Sans Serif"/>
-          <w:b/>
-          <w:sz w:val="18"/>
-          <w:lang w:val="es-MX"/>
-        </w:rPr>
-        <w:t xml:space="preserve">     </w:t>
-      </w:r>
-      <w:r>
-        <w:rPr>
-          <w:rFonts w:ascii="Arial MT" w:hAnsi="Arial MT"/>
-          <w:b/>
-          <w:sz w:val="18"/>
-          <w:lang w:val="es-MX"/>
-        </w:rPr>
-        <w:t>{{</w:t>
-      </w:r>
-      <w:proofErr w:type="spellStart"/>
-      <w:r>
-        <w:rPr>
-          <w:rFonts w:ascii="Arial MT" w:hAnsi="Arial MT"/>
-          <w:b/>
-          <w:sz w:val="18"/>
-          <w:lang w:val="es-MX"/>
-        </w:rPr>
-        <w:t>rol_entrega</w:t>
-      </w:r>
-      <w:proofErr w:type="spellEnd"/>
-      <w:r>
-        <w:rPr>
-          <w:rFonts w:ascii="Arial MT" w:hAnsi="Arial MT"/>
-          <w:b/>
-          <w:sz w:val="18"/>
-          <w:lang w:val="es-MX"/>
-        </w:rPr>
-        <w:t>}}</w:t>
-      </w:r>
-      <w:r>
-        <w:rPr>
-          <w:rFonts w:ascii="Arial MT" w:hAnsi="Arial MT"/>
-          <w:b/>
-          <w:sz w:val="18"/>
-          <w:lang w:val="es-MX"/>
-        </w:rPr>
-        <w:t xml:space="preserve">                                          </w:t>
-      </w:r>
-      <w:r>
-        <w:rPr>
-          <w:rFonts w:ascii="Arial MT" w:hAnsi="Arial MT"/>
-          <w:b/>
-          <w:sz w:val="18"/>
-          <w:lang w:val="es-MX"/>
-        </w:rPr>
-        <w:t xml:space="preserve">    </w:t>
-      </w:r>
-      <w:r>
-        <w:rPr>
-          <w:rFonts w:ascii="Arial MT" w:hAnsi="Arial MT"/>
-          <w:b/>
-          <w:sz w:val="18"/>
-          <w:lang w:val="es-MX"/>
-        </w:rPr>
-        <w:t xml:space="preserve">           </w:t>
-      </w:r>
-      <w:r>
-        <w:rPr>
-          <w:rFonts w:ascii="Arial MT" w:hAnsi="Arial MT"/>
-          <w:b/>
-          <w:sz w:val="18"/>
-          <w:lang w:val="es-MX"/>
-        </w:rPr>
-        <w:t xml:space="preserve">              </w:t>
-      </w:r>
-      <w:r>
-        <w:rPr>
-          <w:rFonts w:ascii="Arial MT" w:hAnsi="Arial MT"/>
-          <w:b/>
-          <w:sz w:val="18"/>
-          <w:lang w:val="es-MX"/>
-        </w:rPr>
-        <w:t xml:space="preserve">USUARIO FINAL                                                                                   </w:t>
-      </w:r>
-      <w:r>
-        <w:rPr>
-          <w:rFonts w:ascii="Arial MT" w:hAnsi="Arial MT"/>
-          <w:b/>
-          <w:sz w:val="18"/>
-          <w:lang w:val="es-MX"/>
-        </w:rPr>
-        <w:t xml:space="preserve">                         </w:t>
-      </w:r>
-      <w:r>
-        <w:rPr>
-          <w:rFonts w:ascii="Arial MT" w:hAnsi="Arial MT"/>
-          <w:b/>
-          <w:sz w:val="18"/>
-          <w:lang w:val="es-MX"/>
-        </w:rPr>
-        <w:t xml:space="preserve">FACULTAD DE JURISPRUCENDIA, CIENCIA    </w:t>
-      </w:r>
-      <w:r>
-        <w:rPr>
-          <w:rFonts w:ascii="Arial MT" w:hAnsi="Arial MT"/>
-          <w:b/>
-          <w:sz w:val="18"/>
-          <w:lang w:val="es-MX"/>
-        </w:rPr>
-        <w:t xml:space="preserve">                   </w:t>
-      </w:r>
-      <w:r>
-        <w:rPr>
-          <w:rFonts w:ascii="Arial MT" w:hAnsi="Arial MT"/>
-          <w:b/>
-          <w:sz w:val="18"/>
-          <w:lang w:val="es-MX"/>
-        </w:rPr>
-        <w:t xml:space="preserve">FACULTAD DE JURISPRUDENCIA, CIENCIAS </w:t>
-      </w:r>
-      <w:r>
-        <w:rPr>
-          <w:rFonts w:ascii="Arial MT" w:hAnsi="Arial MT"/>
-          <w:b/>
-          <w:sz w:val="18"/>
-          <w:lang w:val="es-MX"/>
-        </w:rPr>
-        <w:t xml:space="preserve">    </w:t>
-      </w:r>
-      <w:r>
-        <w:rPr>
-          <w:rFonts w:ascii="Arial MT" w:hAnsi="Arial MT"/>
-          <w:b/>
-          <w:sz w:val="18"/>
-          <w:lang w:val="es-MX"/>
-        </w:rPr>
-        <w:t xml:space="preserve">  </w:t>
-      </w:r>
-      <w:r>
-        <w:rPr>
-          <w:rFonts w:ascii="Arial MT" w:hAnsi="Arial MT"/>
-          <w:b/>
-          <w:sz w:val="18"/>
-          <w:lang w:val="es-MX"/>
-        </w:rPr>
-        <w:t xml:space="preserve">     </w:t>
-      </w:r>
-      <w:r>
-        <w:rPr>
-          <w:rFonts w:ascii="Arial MT" w:hAnsi="Arial MT"/>
-          <w:b/>
-          <w:sz w:val="18"/>
-          <w:lang w:val="es-MX"/>
-        </w:rPr>
-        <w:t xml:space="preserve">SOCIALES Y POLÍTICAS                                                    </w:t>
-      </w:r>
-      <w:r>
-        <w:rPr>
-          <w:rFonts w:ascii="Arial MT" w:hAnsi="Arial MT"/>
-          <w:b/>
-          <w:sz w:val="18"/>
-          <w:lang w:val="es-MX"/>
-        </w:rPr>
-        <w:t xml:space="preserve">      </w:t>
-      </w:r>
-      <w:r>
-        <w:rPr>
-          <w:rFonts w:ascii="Arial MT" w:hAnsi="Arial MT"/>
-          <w:b/>
-          <w:sz w:val="18"/>
-          <w:lang w:val="es-MX"/>
-        </w:rPr>
-        <w:t>SOCIALES Y POLÍTICAS</w:t>
-      </w:r>
-    </w:p>
-    <w:p>
-      <w:pPr>
-        <w:pStyle w:val="NormalWeb"/>
-        <w:spacing w:before="0" w:beforeAutospacing="0"/>
-        <w:rPr>
-          <w:rFonts w:ascii="Arial MT" w:hAnsi="Arial MT"/>
-          <w:b/>
-          <w:sz w:val="20"/>
-          <w:lang w:val="es-MX"/>
-        </w:rPr>
-      </w:pPr>
-      <w:r>
-        <w:rPr>
-          <w:rFonts w:ascii="Arial MT" w:hAnsi="Arial MT"/>
-          <w:b/>
-          <w:sz w:val="20"/>
-          <w:lang w:val="es-MX"/>
-        </w:rPr>
-        <w:t xml:space="preserve">                 </w:t>
-      </w:r>
-      <w:r>
-        <w:rPr>
-          <w:rFonts w:ascii="Arial MT" w:hAnsi="Arial MT"/>
-          <w:b/>
-          <w:sz w:val="20"/>
-          <w:lang w:val="es-MX"/>
-        </w:rPr>
-        <w:t xml:space="preserve">Entrega Conforme              </w:t>
-      </w:r>
-      <w:r>
-        <w:rPr>
-          <w:rFonts w:ascii="Arial MT" w:hAnsi="Arial MT"/>
-          <w:b/>
-          <w:sz w:val="20"/>
-          <w:lang w:val="es-MX"/>
-        </w:rPr>
-        <w:t xml:space="preserve">                     </w:t>
-      </w:r>
-      <w:r>
-        <w:rPr>
-          <w:rFonts w:ascii="Arial MT" w:hAnsi="Arial MT"/>
-          <w:b/>
-          <w:sz w:val="20"/>
-          <w:lang w:val="es-MX"/>
-        </w:rPr>
-        <w:t xml:space="preserve">           </w:t>
-      </w:r>
-      <w:r>
-        <w:rPr>
-          <w:rFonts w:ascii="Arial MT" w:hAnsi="Arial MT"/>
-          <w:b/>
-          <w:sz w:val="20"/>
-          <w:lang w:val="es-MX"/>
-        </w:rPr>
-        <w:t xml:space="preserve">               </w:t>
-      </w:r>
-      <w:r>
-        <w:rPr>
-          <w:rFonts w:ascii="Arial MT" w:hAnsi="Arial MT"/>
-          <w:b/>
-          <w:sz w:val="20"/>
-          <w:lang w:val="es-MX"/>
-        </w:rPr>
-        <w:t>Recibe Conforme</w:t>
-      </w:r>
-    </w:p>
-    <w:p>
-      <w:pPr>
-        <w:pStyle w:val="NormalWeb"/>
-        <w:jc w:val="both"/>
-        <w:rPr>
-          <w:rFonts w:ascii="Microsoft Sans Serif" w:hAnsi="Microsoft Sans Serif" w:cs="Microsoft Sans Serif"/>
-          <w:sz w:val="20"/>
-          <w:lang w:val="es-MX"/>
-        </w:rPr>
-      </w:pPr>
-    </w:p>
-    <w:p>
-      <w:pPr>
-        <w:pStyle w:val="NormalWeb"/>
-        <w:jc w:val="both"/>
-        <w:rPr>
-          <w:rFonts w:ascii="Microsoft Sans Serif" w:hAnsi="Microsoft Sans Serif" w:cs="Microsoft Sans Serif"/>
-          <w:sz w:val="20"/>
-          <w:lang w:val="es-MX"/>
-        </w:rPr>
-      </w:pPr>
-    </w:p>
-    <w:p>
-      <w:pPr>
-        <w:jc w:val="both"/>
-        <w:rPr>
-          <w:sz w:val="16"/>
-          <w:lang w:val="es-MX"/>
-        </w:rPr>
-      </w:pPr>
     </w:p>
     <w:sectPr>
       <w:headerReference w:type="default" r:id="rId7"/>
@@ -3777,6 +3748,86 @@
       <w14:ligatures w14:val="standardContextual"/>
     </w:rPr>
   </w:style>
+  <w:style w:type="table" w:styleId="Tablanormal2">
+    <w:name w:val="Plain Table 2"/>
+    <w:basedOn w:val="Tablanormal"/>
+    <w:uiPriority w:val="42"/>
+    <w:rsid w:val="00506CE2"/>
+    <w:pPr>
+      <w:spacing w:after="0" w:line="240" w:lineRule="auto"/>
+    </w:pPr>
+    <w:tblPr>
+      <w:tblStyleRowBandSize w:val="1"/>
+      <w:tblStyleColBandSize w:val="1"/>
+      <w:tblBorders>
+        <w:top w:val="single" w:sz="4" w:space="0" w:color="7F7F7F" w:themeColor="text1" w:themeTint="80"/>
+        <w:bottom w:val="single" w:sz="4" w:space="0" w:color="7F7F7F" w:themeColor="text1" w:themeTint="80"/>
+      </w:tblBorders>
+    </w:tblPr>
+    <w:tblStylePr w:type="firstRow">
+      <w:rPr>
+        <w:b/>
+        <w:bCs/>
+      </w:rPr>
+      <w:tblPr/>
+      <w:tcPr>
+        <w:tcBorders>
+          <w:bottom w:val="single" w:sz="4" w:space="0" w:color="7F7F7F" w:themeColor="text1" w:themeTint="80"/>
+        </w:tcBorders>
+      </w:tcPr>
+    </w:tblStylePr>
+    <w:tblStylePr w:type="lastRow">
+      <w:rPr>
+        <w:b/>
+        <w:bCs/>
+      </w:rPr>
+      <w:tblPr/>
+      <w:tcPr>
+        <w:tcBorders>
+          <w:top w:val="single" w:sz="4" w:space="0" w:color="7F7F7F" w:themeColor="text1" w:themeTint="80"/>
+        </w:tcBorders>
+      </w:tcPr>
+    </w:tblStylePr>
+    <w:tblStylePr w:type="firstCol">
+      <w:rPr>
+        <w:b/>
+        <w:bCs/>
+      </w:rPr>
+    </w:tblStylePr>
+    <w:tblStylePr w:type="lastCol">
+      <w:rPr>
+        <w:b/>
+        <w:bCs/>
+      </w:rPr>
+    </w:tblStylePr>
+    <w:tblStylePr w:type="band1Vert">
+      <w:tblPr/>
+      <w:tcPr>
+        <w:tcBorders>
+          <w:left w:val="single" w:sz="4" w:space="0" w:color="7F7F7F" w:themeColor="text1" w:themeTint="80"/>
+          <w:right w:val="single" w:sz="4" w:space="0" w:color="7F7F7F" w:themeColor="text1" w:themeTint="80"/>
+        </w:tcBorders>
+      </w:tcPr>
+    </w:tblStylePr>
+    <w:tblStylePr w:type="band2Vert">
+      <w:tblPr/>
+      <w:tcPr>
+        <w:tcBorders>
+          <w:left w:val="single" w:sz="4" w:space="0" w:color="7F7F7F" w:themeColor="text1" w:themeTint="80"/>
+          <w:right w:val="single" w:sz="4" w:space="0" w:color="7F7F7F" w:themeColor="text1" w:themeTint="80"/>
+        </w:tcBorders>
+      </w:tcPr>
+    </w:tblStylePr>
+    <w:tblStylePr w:type="band1Horz">
+      <w:tblPr/>
+      <w:tcPr>
+        <w:tcBorders>
+          <w:top w:val="single" w:sz="4" w:space="0" w:color="7F7F7F" w:themeColor="text1" w:themeTint="80"/>
+          <w:bottom w:val="single" w:sz="4" w:space="0" w:color="7F7F7F" w:themeColor="text1" w:themeTint="80"/>
+        </w:tcBorders>
+      </w:tcPr>
+    </w:tblStylePr>
+  </w:style>
 </w:styles>
 </file>
 

</xml_diff>